<commit_message>
fix(hr): employment contract Article 5 holidays follow the standard wording
Article 5 now lists the weekly paid holiday (Sunday), the unpaid day off
(Saturday), Labor Day, public holidays and the substitute-holiday rule in
the standard order. Article 4 numbering, the period wording in Articles 6
and 8 and "paid on the previous working day" were aligned in both the
fixed-term and the regular templates.

Co-Authored-By: Claude Opus 5.5 <noreply@anthropic.com>
</commit_message>
<xml_diff>
--- a/public/hr/employment-contract-fixed-term.docx
+++ b/public/hr/employment-contract-fixed-term.docx
@@ -1624,7 +1624,7 @@
           <w:rFonts w:ascii="맑은 고딕" w:eastAsia="맑은 고딕" w:hAnsi="맑은 고딕"/>
           <w:sz w:val="18"/>
         </w:rPr>
-        <w:t xml:space="preserve">④ 시업·종업 및 휴게시간을 변경할 필요가 있는 경우 "회사"와 "근로자"는 사전에 합의하고, 법령상 서면 명시가 </w:t>
+        <w:t xml:space="preserve">③ 시업·종업 및 휴게시간을 변경할 필요가 있는 경우 "회사"와 "근로자"는 사전에 합의하고, 법령상 서면 명시가 </w:t>
       </w:r>
       <w:r>
         <w:rPr>
@@ -1649,7 +1649,7 @@
           <w:rFonts w:ascii="맑은 고딕" w:eastAsia="맑은 고딕" w:hAnsi="맑은 고딕"/>
           <w:sz w:val="18"/>
         </w:rPr>
-        <w:t>⑤ 1개월 평균 실제 소정근로시간은 주 35시간 × 365일 ÷ 7일 ÷ 12개월 = 152.08시간(표시상 약 152시간)이다. 유급 주휴 7시간을 포함한 월 임금 환산 기준시간은 (주 35시간 + 주휴 7시간) × 365일 ÷ 7일 ÷ 12개월 = 182.5시간이다. 실제 근로시간과 임금 계산에는 관계 법령 및 정확한 산식에 따른 값을 적용한다.</w:t>
+        <w:t>④ 1개월 평균 실제 소정근로시간은 주 35시간 × 365일 ÷ 7일 ÷ 12개월 = 152.08시간(표시상 약 152시간)이다. 유급 주휴 7시간을 포함한 월 임금 환산 기준시간은 (주 35시간 + 주휴 7시간) × 365일 ÷ 7일 ÷ 12개월 = 182.5시간이다. 실제 근로시간과 임금 계산에는 관계 법령 및 정확한 산식에 따른 값을 적용한다.</w:t>
       </w:r>
     </w:p>
     <w:p>
@@ -1702,7 +1702,7 @@
           <w:rFonts w:ascii="맑은 고딕" w:eastAsia="맑은 고딕" w:hAnsi="맑은 고딕"/>
           <w:sz w:val="18"/>
         </w:rPr>
-        <w:t>① 주휴일은 매주 일요일로 하며, 소정근로일을 충족한 경우 7시간 상당의 유급휴일로 한다.</w:t>
+        <w:t>① 주휴일은 매주 일요일로 하며, 1주 동안의 소정근로일을 개근한 경우 1일 소정근로시간(7시간)분의 유급휴일로 한다.</w:t>
       </w:r>
     </w:p>
     <w:p>
@@ -1718,7 +1718,7 @@
           <w:rFonts w:ascii="맑은 고딕" w:eastAsia="맑은 고딕" w:hAnsi="맑은 고딕"/>
           <w:sz w:val="18"/>
         </w:rPr>
-        <w:t>② 토요일은 무급 휴무일로 한다. 다만, 토요일에 실제 근로한 경우 제7조에 따라 처리한다.</w:t>
+        <w:t>② 토요일은 무급 휴무일로 한다. 토요일에 근로한 경우 이는 휴일근로가 아닌 소정근로시간 외 근로로 보아 제8조에 따라 처리한다.</w:t>
       </w:r>
     </w:p>
     <w:p>
@@ -1734,7 +1734,7 @@
           <w:rFonts w:ascii="맑은 고딕" w:eastAsia="맑은 고딕" w:hAnsi="맑은 고딕"/>
           <w:sz w:val="18"/>
         </w:rPr>
-        <w:t>③ 근로자의 날(5월 1일)과 관공서 공휴일 및 대체공휴일은 관계 법령이 정하는 바에 따라 유급휴일로 한다.</w:t>
+        <w:t>③ 근로자의 날(5월 1일), 관공서의 공휴일(일요일은 제외한다) 및 대체공휴일은 유급휴일로 한다.</w:t>
       </w:r>
     </w:p>
     <w:p>
@@ -1750,7 +1750,23 @@
           <w:rFonts w:ascii="맑은 고딕" w:eastAsia="맑은 고딕" w:hAnsi="맑은 고딕"/>
           <w:sz w:val="18"/>
         </w:rPr>
-        <w:t>④ 업무상 필요한 경우 관계 법령과 적법한 절차에 따라 휴일을 다른 근로일로 대체할 수 있다.</w:t>
+        <w:t>④ 업무상 필요한 경우 "회사"는 대체할 날을 특정하여 사전에 통보하고 주휴일을 다른 근로일로 대체할 수 있다. 제3항의 공휴일 및 대체공휴일은 근로자대표와 서면으로 합의한 경우에만 특정한 근로일로 대체할 수 있으며, 근로자의 날은 대체하지 아니한다.</w:t>
+      </w:r>
+    </w:p>
+    <w:p>
+      <w:pPr>
+        <w:pStyle w:val="a3"/>
+        <w:spacing w:line="336" w:lineRule="auto"/>
+        <w:rPr>
+          <w:rFonts w:ascii="맑은 고딕" w:eastAsia="맑은 고딕" w:hAnsi="맑은 고딕"/>
+        </w:rPr>
+      </w:pPr>
+      <w:r>
+        <w:rPr>
+          <w:rFonts w:ascii="맑은 고딕" w:eastAsia="맑은 고딕" w:hAnsi="맑은 고딕"/>
+          <w:sz w:val="18"/>
+        </w:rPr>
+        <w:t>⑤ 휴일에 근로한 경우 제8조에 따라 휴일근로 가산수당을 지급한다.</w:t>
       </w:r>
     </w:p>
     <w:p>
@@ -1850,7 +1866,7 @@
           <w:sz w:val="18"/>
           <w:shd w:val="clear" w:color="000000" w:fill="auto"/>
         </w:rPr>
-        <w:t>③. 근무시간 중 업무에 지장을 주는 장시간의 사적 통화, 과도한 휴대전화·인터넷·SNS 이용, 주식거래 또는 게임을 하지 않는다. 다만, 긴급하거나 합리적인 사유가 있는 경우와 휴게시간 중의 이용은 예외로 한다.</w:t>
+        <w:t>③ 근무시간 중 업무에 지장을 주는 장시간의 사적 통화, 과도한 휴대전화·인터넷·SNS 이용, 주식거래 또는 게임을 하지 않는다. 다만, 긴급하거나 합리적인 사유가 있는 경우와 휴게시간 중의 이용은 예외로 한다.</w:t>
       </w:r>
     </w:p>
     <w:p>
@@ -1868,7 +1884,7 @@
           <w:sz w:val="18"/>
           <w:shd w:val="clear" w:color="000000" w:fill="auto"/>
         </w:rPr>
-        <w:t xml:space="preserve">④. </w:t>
+        <w:t xml:space="preserve">④ </w:t>
       </w:r>
       <w:r>
         <w:rPr>
@@ -2487,7 +2503,7 @@
                 <w:spacing w:val="-5"/>
                 <w:sz w:val="18"/>
               </w:rPr>
-              <w:t>일 지급. 지급일이 휴일인 경우에는 그 전일에 지급</w:t>
+              <w:t>일 지급. 지급일이 휴일인 경우에는 직전 근로일에 지급</w:t>
             </w:r>
           </w:p>
         </w:tc>
@@ -3125,7 +3141,7 @@
           <w:sz w:val="18"/>
           <w:shd w:val="clear" w:color="000000" w:fill="auto"/>
         </w:rPr>
-        <w:t>②. "근로자"는 원칙적으로 "회사"의 사전 요청 또는 승인 없이 임의로 시간외근로를 하지 않는다. 다만, "회사"가 지시·승인하거나 알고도 용인한 실제 근로 시간은 객관적 기록에 따라 처리한다.</w:t>
+        <w:t>② "근로자"는 원칙적으로 "회사"의 사전 요청 또는 승인 없이 임의로 시간외근로를 하지 않는다. 다만, "회사"가 지시·승인하거나 알고도 용인한 실제 근로 시간은 객관적 기록에 따라 처리한다.</w:t>
       </w:r>
     </w:p>
     <w:p>
@@ -3143,7 +3159,7 @@
           <w:sz w:val="18"/>
           <w:shd w:val="clear" w:color="000000" w:fill="auto"/>
         </w:rPr>
-        <w:t>③. 소정근로시간을 초과하지만 1일 8시간 · 1주 40시간 이내인 근로에는 해당 시간의 통상임금 100%를 지급한다. 취업규칙 등에 더 유리한 기준이 있으면 그 기준을 적용한다.</w:t>
+        <w:t>③ 소정근로시간을 초과하지만 1일 8시간 · 1주 40시간 이내인 근로에는 해당 시간의 통상임금 100%를 지급한다. 취업규칙 등에 더 유리한 기준이 있으면 그 기준을 적용한다.</w:t>
       </w:r>
     </w:p>
     <w:p>
@@ -3161,7 +3177,7 @@
           <w:sz w:val="18"/>
           <w:shd w:val="clear" w:color="000000" w:fill="auto"/>
         </w:rPr>
-        <w:t xml:space="preserve">④. 1일 8시간 또는 1주 40시간을 초과한 연장근로에는 통상임금의 50% 이상을 가산하고, 야간근로(22:00~06:00)에는 50% 이상을 가산한다. 휴일 근로는 8시간 이내 50% 이상, 8시간 </w:t>
+        <w:t xml:space="preserve">④ 1일 8시간 또는 1주 40시간을 초과한 연장근로에는 통상임금의 50% 이상을 가산하고, 야간근로(22:00~06:00)에는 50% 이상을 가산한다. 휴일 근로는 8시간 이내 50% 이상, 8시간 </w:t>
       </w:r>
       <w:proofErr w:type="spellStart"/>
       <w:r>
@@ -3215,7 +3231,7 @@
           <w:sz w:val="18"/>
           <w:shd w:val="clear" w:color="000000" w:fill="auto"/>
         </w:rPr>
-        <w:t>⑤. 시간외근로의 신청·승인·기록 및 그 밖의 세부 사항은 관계 법령과 취업규칙에 따른다.</w:t>
+        <w:t>⑤ 시간외근로의 신청·승인·기록 및 그 밖의 세부 사항은 관계 법령과 취업규칙에 따른다.</w:t>
       </w:r>
     </w:p>
     <w:p>

</xml_diff>